<commit_message>
ContrastBrightnessFilter class have been written
</commit_message>
<xml_diff>
--- a/doc/initial_specification.docx
+++ b/doc/initial_specification.docx
@@ -105,7 +105,7 @@
         <w:pStyle w:val="normal1"/>
         <w:numPr>
           <w:ilvl w:val="0"/>
-          <w:numId w:val="2"/>
+          <w:numId w:val="1"/>
         </w:numPr>
         <w:ind w:hanging="360" w:left="720"/>
         <w:rPr>
@@ -122,7 +122,7 @@
         <w:pStyle w:val="normal1"/>
         <w:numPr>
           <w:ilvl w:val="0"/>
-          <w:numId w:val="2"/>
+          <w:numId w:val="1"/>
         </w:numPr>
         <w:ind w:hanging="360" w:left="720"/>
         <w:rPr>
@@ -139,7 +139,7 @@
         <w:pStyle w:val="normal1"/>
         <w:numPr>
           <w:ilvl w:val="0"/>
-          <w:numId w:val="2"/>
+          <w:numId w:val="1"/>
         </w:numPr>
         <w:ind w:hanging="360" w:left="720"/>
         <w:rPr>
@@ -156,7 +156,7 @@
         <w:pStyle w:val="normal1"/>
         <w:numPr>
           <w:ilvl w:val="0"/>
-          <w:numId w:val="2"/>
+          <w:numId w:val="1"/>
         </w:numPr>
         <w:ind w:hanging="360" w:left="720"/>
         <w:rPr>
@@ -173,7 +173,7 @@
         <w:pStyle w:val="normal1"/>
         <w:numPr>
           <w:ilvl w:val="0"/>
-          <w:numId w:val="2"/>
+          <w:numId w:val="1"/>
         </w:numPr>
         <w:ind w:hanging="360" w:left="720"/>
         <w:rPr>
@@ -190,7 +190,7 @@
         <w:pStyle w:val="normal1"/>
         <w:numPr>
           <w:ilvl w:val="0"/>
-          <w:numId w:val="2"/>
+          <w:numId w:val="1"/>
         </w:numPr>
         <w:ind w:hanging="360" w:left="720"/>
         <w:rPr>
@@ -265,143 +265,6 @@
   <w:abstractNum w:abstractNumId="1">
     <w:lvl w:ilvl="0">
       <w:start w:val="1"/>
-      <w:numFmt w:val="decimal"/>
-      <w:lvlText w:val="%1."/>
-      <w:lvlJc w:val="left"/>
-      <w:pPr>
-        <w:tabs>
-          <w:tab w:val="num" w:pos="0"/>
-        </w:tabs>
-        <w:ind w:left="720" w:hanging="360"/>
-      </w:pPr>
-      <w:rPr>
-        <w:u w:val="none"/>
-      </w:rPr>
-    </w:lvl>
-    <w:lvl w:ilvl="1">
-      <w:start w:val="1"/>
-      <w:numFmt w:val="lowerLetter"/>
-      <w:lvlText w:val="%2."/>
-      <w:lvlJc w:val="left"/>
-      <w:pPr>
-        <w:tabs>
-          <w:tab w:val="num" w:pos="0"/>
-        </w:tabs>
-        <w:ind w:left="1440" w:hanging="360"/>
-      </w:pPr>
-      <w:rPr>
-        <w:u w:val="none"/>
-      </w:rPr>
-    </w:lvl>
-    <w:lvl w:ilvl="2">
-      <w:start w:val="1"/>
-      <w:numFmt w:val="lowerRoman"/>
-      <w:lvlText w:val="%3."/>
-      <w:lvlJc w:val="right"/>
-      <w:pPr>
-        <w:tabs>
-          <w:tab w:val="num" w:pos="0"/>
-        </w:tabs>
-        <w:ind w:left="2160" w:hanging="360"/>
-      </w:pPr>
-      <w:rPr>
-        <w:u w:val="none"/>
-      </w:rPr>
-    </w:lvl>
-    <w:lvl w:ilvl="3">
-      <w:start w:val="1"/>
-      <w:numFmt w:val="decimal"/>
-      <w:lvlText w:val="%4."/>
-      <w:lvlJc w:val="left"/>
-      <w:pPr>
-        <w:tabs>
-          <w:tab w:val="num" w:pos="0"/>
-        </w:tabs>
-        <w:ind w:left="2880" w:hanging="360"/>
-      </w:pPr>
-      <w:rPr>
-        <w:u w:val="none"/>
-      </w:rPr>
-    </w:lvl>
-    <w:lvl w:ilvl="4">
-      <w:start w:val="1"/>
-      <w:numFmt w:val="lowerLetter"/>
-      <w:lvlText w:val="%5."/>
-      <w:lvlJc w:val="left"/>
-      <w:pPr>
-        <w:tabs>
-          <w:tab w:val="num" w:pos="0"/>
-        </w:tabs>
-        <w:ind w:left="3600" w:hanging="360"/>
-      </w:pPr>
-      <w:rPr>
-        <w:u w:val="none"/>
-      </w:rPr>
-    </w:lvl>
-    <w:lvl w:ilvl="5">
-      <w:start w:val="1"/>
-      <w:numFmt w:val="lowerRoman"/>
-      <w:lvlText w:val="%6."/>
-      <w:lvlJc w:val="right"/>
-      <w:pPr>
-        <w:tabs>
-          <w:tab w:val="num" w:pos="0"/>
-        </w:tabs>
-        <w:ind w:left="4320" w:hanging="360"/>
-      </w:pPr>
-      <w:rPr>
-        <w:u w:val="none"/>
-      </w:rPr>
-    </w:lvl>
-    <w:lvl w:ilvl="6">
-      <w:start w:val="1"/>
-      <w:numFmt w:val="decimal"/>
-      <w:lvlText w:val="%7."/>
-      <w:lvlJc w:val="left"/>
-      <w:pPr>
-        <w:tabs>
-          <w:tab w:val="num" w:pos="0"/>
-        </w:tabs>
-        <w:ind w:left="5040" w:hanging="360"/>
-      </w:pPr>
-      <w:rPr>
-        <w:u w:val="none"/>
-      </w:rPr>
-    </w:lvl>
-    <w:lvl w:ilvl="7">
-      <w:start w:val="1"/>
-      <w:numFmt w:val="lowerLetter"/>
-      <w:lvlText w:val="%8."/>
-      <w:lvlJc w:val="left"/>
-      <w:pPr>
-        <w:tabs>
-          <w:tab w:val="num" w:pos="0"/>
-        </w:tabs>
-        <w:ind w:left="5760" w:hanging="360"/>
-      </w:pPr>
-      <w:rPr>
-        <w:u w:val="none"/>
-      </w:rPr>
-    </w:lvl>
-    <w:lvl w:ilvl="8">
-      <w:start w:val="1"/>
-      <w:numFmt w:val="lowerRoman"/>
-      <w:lvlText w:val="%9."/>
-      <w:lvlJc w:val="right"/>
-      <w:pPr>
-        <w:tabs>
-          <w:tab w:val="num" w:pos="0"/>
-        </w:tabs>
-        <w:ind w:left="6480" w:hanging="360"/>
-      </w:pPr>
-      <w:rPr>
-        <w:u w:val="none"/>
-      </w:rPr>
-    </w:lvl>
-  </w:abstractNum>
-  <w:abstractNum w:abstractNumId="2">
-    <w:lvl w:ilvl="0">
-      <w:start w:val="1"/>
       <w:numFmt w:val="bullet"/>
       <w:lvlText w:val="-"/>
       <w:lvlJc w:val="left"/>
@@ -545,7 +408,7 @@
       </w:rPr>
     </w:lvl>
   </w:abstractNum>
-  <w:abstractNum w:abstractNumId="3">
+  <w:abstractNum w:abstractNumId="2">
     <w:lvl w:ilvl="0">
       <w:start w:val="1"/>
       <w:numFmt w:val="none"/>
@@ -669,9 +532,6 @@
   </w:num>
   <w:num w:numId="2">
     <w:abstractNumId w:val="2"/>
-  </w:num>
-  <w:num w:numId="3">
-    <w:abstractNumId w:val="3"/>
   </w:num>
 </w:numbering>
 </file>
@@ -698,6 +558,7 @@
     <w:qFormat/>
     <w:pPr>
       <w:widowControl/>
+      <w:suppressAutoHyphens w:val="true"/>
       <w:bidi w:val="0"/>
       <w:spacing w:lineRule="auto" w:line="276" w:before="0" w:after="0"/>
       <w:jc w:val="both"/>
@@ -884,6 +745,7 @@
     <w:qFormat/>
     <w:pPr>
       <w:widowControl/>
+      <w:suppressAutoHyphens w:val="true"/>
       <w:bidi w:val="0"/>
       <w:spacing w:lineRule="auto" w:line="276" w:before="0" w:after="0"/>
       <w:jc w:val="both"/>

</xml_diff>